<commit_message>
Quotes restructured to two-option frame (A entry / B full) with trade-specific add-ons
Barbers/salons/studios/food/trades lead with The Signpost R4,500 (+ booking + WhatsApp automation add-ons); salons additionally get specials hero banner + online-shop upsell; clinics and estate/dining lead Foundation vs Structure. All 30 quotes + Word versions regenerated.

Co-Authored-By: Claude Fable 5 <noreply@anthropic.com>
</commit_message>
<xml_diff>
--- a/areeb-guru-barber-shop/docs/quote.docx
+++ b/areeb-guru-barber-shop/docs/quote.docx
@@ -257,7 +257,342 @@
           <w:sz w:val="26"/>
           <w:szCs w:val="26"/>
         </w:rPr>
-        <w:t xml:space="preserve">Recommended path</w:t>
+        <w:t xml:space="preserve">Two ways to start — pick the one that fits</w:t>
+      </w:r>
+    </w:p>
+    <w:p>
+      <w:pPr>
+        <w:spacing w:after="100"/>
+      </w:pPr>
+      <w:r>
+        <w:rPr>
+          <w:sz w:val="21"/>
+          <w:szCs w:val="21"/>
+        </w:rPr>
+        <w:t xml:space="preserve">Most owners we meet don't need to decide </w:t>
+      </w:r>
+      <w:r>
+        <w:rPr>
+          <w:i/>
+          <w:iCs/>
+          <w:sz w:val="21"/>
+          <w:szCs w:val="21"/>
+        </w:rPr>
+        <w:t xml:space="preserve">whether</w:t>
+      </w:r>
+      <w:r>
+        <w:rPr>
+          <w:sz w:val="21"/>
+          <w:szCs w:val="21"/>
+        </w:rPr>
+        <w:t xml:space="preserve"> to have a site — just </w:t>
+      </w:r>
+      <w:r>
+        <w:rPr>
+          <w:i/>
+          <w:iCs/>
+          <w:sz w:val="21"/>
+          <w:szCs w:val="21"/>
+        </w:rPr>
+        <w:t xml:space="preserve">which</w:t>
+      </w:r>
+      <w:r>
+        <w:rPr>
+          <w:sz w:val="21"/>
+          <w:szCs w:val="21"/>
+        </w:rPr>
+        <w:t xml:space="preserve"> version to start with. Both options below are the demo you've already seen; they differ in depth, not quality.</w:t>
+      </w:r>
+    </w:p>
+    <w:p>
+      <w:pPr>
+        <w:pStyle w:val="Heading3"/>
+        <w:spacing w:after="60" w:before="160"/>
+      </w:pPr>
+      <w:r>
+        <w:rPr>
+          <w:b/>
+          <w:bCs/>
+          <w:color w:val="1C1A17"/>
+          <w:sz w:val="22"/>
+          <w:szCs w:val="22"/>
+        </w:rPr>
+        <w:t xml:space="preserve">Option A — The Signpost · R4,500 once-off</w:t>
+      </w:r>
+    </w:p>
+    <w:p>
+      <w:pPr>
+        <w:spacing w:after="100"/>
+      </w:pPr>
+      <w:r>
+        <w:rPr>
+          <w:sz w:val="21"/>
+          <w:szCs w:val="21"/>
+        </w:rPr>
+        <w:t xml:space="preserve">The demo cut down to one premium scrolling page: hero, services, gallery strip, hours-to-confirm, click-to-call + WhatsApp, Google Maps + Navigate, and a lead-capture form. Live in about a week. It puts the shop on the map properly without a big spend.</w:t>
+      </w:r>
+    </w:p>
+    <w:p>
+      <w:pPr>
+        <w:spacing w:after="100"/>
+      </w:pPr>
+      <w:r>
+        <w:rPr>
+          <w:sz w:val="21"/>
+          <w:szCs w:val="21"/>
+        </w:rPr>
+        <w:t xml:space="preserve">Add-ons that fit (optional, any time):</w:t>
+      </w:r>
+    </w:p>
+    <w:p>
+      <w:pPr>
+        <w:pStyle w:val="ListParagraph"/>
+        <w:numPr>
+          <w:ilvl w:val="0"/>
+          <w:numId w:val="2"/>
+        </w:numPr>
+        <w:spacing w:after="40"/>
+      </w:pPr>
+      <w:r>
+        <w:rPr>
+          <w:b/>
+          <w:bCs/>
+          <w:sz w:val="21"/>
+          <w:szCs w:val="21"/>
+        </w:rPr>
+        <w:t xml:space="preserve">Booking/calendar integration — R3,600</w:t>
+      </w:r>
+      <w:r>
+        <w:rPr>
+          <w:sz w:val="21"/>
+          <w:szCs w:val="21"/>
+        </w:rPr>
+        <w:t xml:space="preserve"> — real online booking instead of "message to book"; the demo's chatbot already primes for it.</w:t>
+      </w:r>
+    </w:p>
+    <w:p>
+      <w:pPr>
+        <w:pStyle w:val="ListParagraph"/>
+        <w:numPr>
+          <w:ilvl w:val="0"/>
+          <w:numId w:val="2"/>
+        </w:numPr>
+        <w:spacing w:after="40"/>
+      </w:pPr>
+      <w:r>
+        <w:rPr>
+          <w:b/>
+          <w:bCs/>
+          <w:sz w:val="21"/>
+          <w:szCs w:val="21"/>
+        </w:rPr>
+        <w:t xml:space="preserve">WhatsApp automation — R6,500 setup</w:t>
+      </w:r>
+      <w:r>
+        <w:rPr>
+          <w:sz w:val="21"/>
+          <w:szCs w:val="21"/>
+        </w:rPr>
+        <w:t xml:space="preserve"> — auto-replies, FAQ handling and lead capture on WhatsApp Business.</w:t>
+      </w:r>
+    </w:p>
+    <w:p>
+      <w:pPr>
+        <w:pStyle w:val="Heading3"/>
+        <w:spacing w:after="60" w:before="160"/>
+      </w:pPr>
+      <w:r>
+        <w:rPr>
+          <w:b/>
+          <w:bCs/>
+          <w:color w:val="1C1A17"/>
+          <w:sz w:val="22"/>
+          <w:szCs w:val="22"/>
+        </w:rPr>
+        <w:t xml:space="preserve">Option B — The Foundation · R16,500 once-off</w:t>
+      </w:r>
+    </w:p>
+    <w:p>
+      <w:pPr>
+        <w:spacing w:after="100"/>
+      </w:pPr>
+      <w:r>
+        <w:rPr>
+          <w:sz w:val="21"/>
+          <w:szCs w:val="21"/>
+        </w:rPr>
+        <w:t xml:space="preserve">The full demo as seen — up to 5 sections/pages, signature motion, the grooming Journal (</w:t>
+      </w:r>
+      <w:r>
+        <w:rPr>
+          <w:rFonts w:ascii="Consolas" w:cs="Consolas" w:eastAsia="Consolas" w:hAnsi="Consolas"/>
+          <w:sz w:val="21"/>
+          <w:szCs w:val="21"/>
+        </w:rPr>
+        <w:t xml:space="preserve">learn.html</w:t>
+      </w:r>
+      <w:r>
+        <w:rPr>
+          <w:sz w:val="21"/>
+          <w:szCs w:val="21"/>
+        </w:rPr>
+        <w:t xml:space="preserve">), on-page SEO, hosting + domain + deployment handled, 2 revision rounds.</w:t>
+      </w:r>
+    </w:p>
+    <w:p>
+      <w:pPr>
+        <w:spacing w:after="100"/>
+      </w:pPr>
+      <w:r>
+        <w:rPr>
+          <w:sz w:val="21"/>
+          <w:szCs w:val="21"/>
+        </w:rPr>
+        <w:t xml:space="preserve">Add-ons that fit (optional, any time):</w:t>
+      </w:r>
+    </w:p>
+    <w:p>
+      <w:pPr>
+        <w:pStyle w:val="ListParagraph"/>
+        <w:numPr>
+          <w:ilvl w:val="0"/>
+          <w:numId w:val="2"/>
+        </w:numPr>
+        <w:spacing w:after="40"/>
+      </w:pPr>
+      <w:r>
+        <w:rPr>
+          <w:b/>
+          <w:bCs/>
+          <w:sz w:val="21"/>
+          <w:szCs w:val="21"/>
+        </w:rPr>
+        <w:t xml:space="preserve">Booking/calendar integration — R3,600</w:t>
+      </w:r>
+      <w:r>
+        <w:rPr>
+          <w:sz w:val="21"/>
+          <w:szCs w:val="21"/>
+        </w:rPr>
+        <w:t xml:space="preserve"> — real online booking instead of "message to book"; the demo's chatbot already primes for it.</w:t>
+      </w:r>
+    </w:p>
+    <w:p>
+      <w:pPr>
+        <w:pStyle w:val="ListParagraph"/>
+        <w:numPr>
+          <w:ilvl w:val="0"/>
+          <w:numId w:val="2"/>
+        </w:numPr>
+        <w:spacing w:after="40"/>
+      </w:pPr>
+      <w:r>
+        <w:rPr>
+          <w:b/>
+          <w:bCs/>
+          <w:sz w:val="21"/>
+          <w:szCs w:val="21"/>
+        </w:rPr>
+        <w:t xml:space="preserve">WhatsApp automation — R6,500 setup</w:t>
+      </w:r>
+      <w:r>
+        <w:rPr>
+          <w:sz w:val="21"/>
+          <w:szCs w:val="21"/>
+        </w:rPr>
+        <w:t xml:space="preserve"> — auto-replies, FAQ handling and lead capture on WhatsApp Business.</w:t>
+      </w:r>
+    </w:p>
+    <w:p>
+      <w:pPr>
+        <w:pStyle w:val="ListParagraph"/>
+        <w:numPr>
+          <w:ilvl w:val="0"/>
+          <w:numId w:val="2"/>
+        </w:numPr>
+        <w:spacing w:after="40"/>
+      </w:pPr>
+      <w:r>
+        <w:rPr>
+          <w:b/>
+          <w:bCs/>
+          <w:sz w:val="21"/>
+          <w:szCs w:val="21"/>
+        </w:rPr>
+        <w:t xml:space="preserve">SEO Launch setup — R4,500 once</w:t>
+      </w:r>
+      <w:r>
+        <w:rPr>
+          <w:sz w:val="21"/>
+          <w:szCs w:val="21"/>
+        </w:rPr>
+        <w:t xml:space="preserve"> — titles/meta/schema/GBP so "barber near me" searches actually find the shop.</w:t>
+      </w:r>
+    </w:p>
+    <w:p>
+      <w:pPr>
+        <w:spacing w:after="100"/>
+      </w:pPr>
+      <w:r>
+        <w:rPr>
+          <w:sz w:val="21"/>
+          <w:szCs w:val="21"/>
+        </w:rPr>
+        <w:t xml:space="preserve">Both options include a care plan from </w:t>
+      </w:r>
+      <w:r>
+        <w:rPr>
+          <w:b/>
+          <w:bCs/>
+          <w:sz w:val="21"/>
+          <w:szCs w:val="21"/>
+        </w:rPr>
+        <w:t xml:space="preserve">Essential R450 pm</w:t>
+      </w:r>
+      <w:r>
+        <w:rPr>
+          <w:sz w:val="21"/>
+          <w:szCs w:val="21"/>
+        </w:rPr>
+        <w:t xml:space="preserve"> (hosting, SSL, backups, uptime, security, 30 min of changes/month). Everything can move from A to B later — nothing is thrown away.</w:t>
+      </w:r>
+    </w:p>
+    <w:p>
+      <w:pPr>
+        <w:spacing w:after="100"/>
+      </w:pPr>
+      <w:r>
+        <w:rPr>
+          <w:i/>
+          <w:iCs/>
+          <w:sz w:val="21"/>
+          <w:szCs w:val="21"/>
+        </w:rPr>
+        <w:t xml:space="preserve">Sales note (internal): Barbershops are walk-in, phone-first businesses — most owners start with A and add booking once they see enquiries arrive. Present both; let them pick.</w:t>
+      </w:r>
+    </w:p>
+    <w:p>
+      <w:pPr>
+        <w:pBdr>
+          <w:bottom w:val="single" w:color="CCCCCC" w:sz="4"/>
+        </w:pBdr>
+        <w:spacing w:after="120"/>
+      </w:pPr>
+    </w:p>
+    <w:p>
+      <w:pPr>
+        <w:pStyle w:val="Heading2"/>
+        <w:spacing w:after="100" w:before="240"/>
+      </w:pPr>
+      <w:r>
+        <w:rPr>
+          <w:b/>
+          <w:bCs/>
+          <w:color w:val="0E3F3A"/>
+          <w:sz w:val="26"/>
+          <w:szCs w:val="26"/>
+        </w:rPr>
+        <w:t xml:space="preserve">Our recommendation between the two</w:t>
       </w:r>
     </w:p>
     <w:p>

</xml_diff>